<commit_message>
Deploying to gh-pages from @ Morrison-Lab/mcs@739354a0c71391be530489afa9bd0c9a97766864 🚀
</commit_message>
<xml_diff>
--- a/chapters/contrapositive-contradiction.docx
+++ b/chapters/contrapositive-contradiction.docx
@@ -23,7 +23,7 @@
         <w:pStyle w:val="Date"/>
       </w:pPr>
       <w:r>
-        <w:t xml:space="preserve">Last modified: 2026-10-23 14:42:37 (PDT)</w:t>
+        <w:t xml:space="preserve">Last modified: 2026-10-23 14:52:29 (PDT)</w:t>
       </w:r>
     </w:p>
     <w:tbl>
@@ -156,7 +156,7 @@
               <w:t xml:space="preserve"> </w:t>
             </w:r>
             <w:r>
-              <w:t xml:space="preserve">which he typeset from Scott Wehrwein’s Spring 2025 handwritten lecture notes.</w:t>
+              <w:t xml:space="preserve">which are typed transcriptions of Scott Wehrwein’s Spring 2025 handwritten lecture notes.</w:t>
             </w:r>
             <w:r>
               <w:t xml:space="preserve"> </w:t>
@@ -4147,7 +4147,7 @@
           <w:rPr>
             <w:rStyle w:val="Hyperlink"/>
           </w:rPr>
-          <w:t xml:space="preserve">Theorem: De Morgan's laws</w:t>
+          <w:t xml:space="preserve">Theorem: De Morgan’s laws</w:t>
         </w:r>
       </w:hyperlink>
       <w:r>

</xml_diff>